<commit_message>
Finished adding all the feedback
✅ Schedule rendering fixed
✅ Missing return show_details bug fixed
✅ Weekday added to dates
✅ Show Length synchronization
✅ Capacity synchronization
✅ Ticketing Fee calculations and contract rendering
✅ Production/Catering split throughout Contracts and Profiles
✅ Special Provisions filling fixed
✅ Additional Addenda filling fixed
✅ Complimentary Tickets filling fixed
✅ Complimentary Tickets moved into the Terms section
✅ City-specific labels (Bogota Date, Bogota Venue, etc.)
</commit_message>
<xml_diff>
--- a/templates/performance_multi.docx
+++ b/templates/performance_multi.docx
@@ -803,8 +803,8 @@
               <w:tblLook w:val="0600"/>
             </w:tblPr>
             <w:tblGrid>
-              <w:gridCol w:w="2578"/>
-              <w:gridCol w:w="7457"/>
+              <w:gridCol w:w="2577"/>
+              <w:gridCol w:w="7458"/>
             </w:tblGrid>
             <w:tr>
               <w:trPr>
@@ -902,7 +902,7 @@
               </w:trPr>
               <w:tc>
                 <w:tcPr>
-                  <w:tcW w:w="2578" w:type="dxa"/>
+                  <w:tcW w:w="2577" w:type="dxa"/>
                   <w:tcBorders>
                     <w:top w:val="single" w:sz="4" w:space="0" w:color="000000"/>
                     <w:start w:val="single" w:sz="4" w:space="0" w:color="000000"/>
@@ -996,7 +996,7 @@
               </w:tc>
               <w:tc>
                 <w:tcPr>
-                  <w:tcW w:w="7457" w:type="dxa"/>
+                  <w:tcW w:w="7458" w:type="dxa"/>
                   <w:tcBorders>
                     <w:top w:val="single" w:sz="4" w:space="0" w:color="000000"/>
                     <w:start w:val="single" w:sz="4" w:space="0" w:color="FFFFFF"/>
@@ -1303,8 +1303,8 @@
               <w:tblLook w:val="0600"/>
             </w:tblPr>
             <w:tblGrid>
-              <w:gridCol w:w="2578"/>
-              <w:gridCol w:w="7457"/>
+              <w:gridCol w:w="2577"/>
+              <w:gridCol w:w="7458"/>
             </w:tblGrid>
             <w:tr>
               <w:trPr>
@@ -1394,7 +1394,7 @@
               </w:trPr>
               <w:tc>
                 <w:tcPr>
-                  <w:tcW w:w="2578" w:type="dxa"/>
+                  <w:tcW w:w="2577" w:type="dxa"/>
                   <w:tcBorders>
                     <w:top w:val="single" w:sz="4" w:space="0" w:color="000000"/>
                     <w:start w:val="single" w:sz="4" w:space="0" w:color="000000"/>
@@ -1489,7 +1489,7 @@
               </w:tc>
               <w:tc>
                 <w:tcPr>
-                  <w:tcW w:w="7457" w:type="dxa"/>
+                  <w:tcW w:w="7458" w:type="dxa"/>
                   <w:tcBorders>
                     <w:top w:val="single" w:sz="4" w:space="0" w:color="000000"/>
                     <w:start w:val="single" w:sz="4" w:space="0" w:color="FFFFFF"/>
@@ -3067,9 +3067,9 @@
             </w:tblPr>
             <w:tblGrid>
               <w:gridCol w:w="1760"/>
-              <w:gridCol w:w="2458"/>
+              <w:gridCol w:w="2457"/>
               <w:gridCol w:w="1940"/>
-              <w:gridCol w:w="1921"/>
+              <w:gridCol w:w="1922"/>
               <w:gridCol w:w="2089"/>
             </w:tblGrid>
             <w:tr>
@@ -3105,7 +3105,7 @@
               </w:tc>
               <w:tc>
                 <w:tcPr>
-                  <w:tcW w:w="2458" w:type="dxa"/>
+                  <w:tcW w:w="2457" w:type="dxa"/>
                   <w:tcBorders/>
                   <w:shd w:fill="auto" w:val="clear"/>
                 </w:tcPr>
@@ -3161,7 +3161,7 @@
               </w:tc>
               <w:tc>
                 <w:tcPr>
-                  <w:tcW w:w="1921" w:type="dxa"/>
+                  <w:tcW w:w="1922" w:type="dxa"/>
                   <w:tcBorders/>
                   <w:shd w:fill="auto" w:val="clear"/>
                   <w:tcMar>
@@ -3286,7 +3286,7 @@
               </w:tc>
               <w:tc>
                 <w:tcPr>
-                  <w:tcW w:w="2458" w:type="dxa"/>
+                  <w:tcW w:w="2457" w:type="dxa"/>
                   <w:tcBorders/>
                   <w:shd w:fill="auto" w:val="clear"/>
                 </w:tcPr>
@@ -3342,7 +3342,7 @@
               </w:tc>
               <w:tc>
                 <w:tcPr>
-                  <w:tcW w:w="1921" w:type="dxa"/>
+                  <w:tcW w:w="1922" w:type="dxa"/>
                   <w:tcBorders/>
                   <w:shd w:fill="auto" w:val="clear"/>
                   <w:tcMar>
@@ -3621,11 +3621,11 @@
         <w:tblLook w:val="0600"/>
       </w:tblPr>
       <w:tblGrid>
-        <w:gridCol w:w="4318"/>
+        <w:gridCol w:w="4317"/>
         <w:gridCol w:w="1476"/>
-        <w:gridCol w:w="1478"/>
-        <w:gridCol w:w="1474"/>
-        <w:gridCol w:w="1478"/>
+        <w:gridCol w:w="1479"/>
+        <w:gridCol w:w="1473"/>
+        <w:gridCol w:w="1479"/>
       </w:tblGrid>
       <w:tr>
         <w:trPr>
@@ -3633,7 +3633,7 @@
         </w:trPr>
         <w:tc>
           <w:tcPr>
-            <w:tcW w:w="4318" w:type="dxa"/>
+            <w:tcW w:w="4317" w:type="dxa"/>
             <w:tcBorders>
               <w:top w:val="single" w:sz="4" w:space="0" w:color="F3F3F3"/>
               <w:start w:val="single" w:sz="4" w:space="0" w:color="F3F3F3"/>
@@ -3700,7 +3700,7 @@
         </w:tc>
         <w:tc>
           <w:tcPr>
-            <w:tcW w:w="1478" w:type="dxa"/>
+            <w:tcW w:w="1479" w:type="dxa"/>
             <w:tcBorders>
               <w:top w:val="single" w:sz="4" w:space="0" w:color="F3F3F3"/>
               <w:start w:val="single" w:sz="4" w:space="0" w:color="F3F3F3"/>
@@ -3734,7 +3734,7 @@
         </w:tc>
         <w:tc>
           <w:tcPr>
-            <w:tcW w:w="1474" w:type="dxa"/>
+            <w:tcW w:w="1473" w:type="dxa"/>
             <w:tcBorders>
               <w:top w:val="single" w:sz="4" w:space="0" w:color="F3F3F3"/>
               <w:start w:val="single" w:sz="4" w:space="0" w:color="F3F3F3"/>
@@ -3768,7 +3768,7 @@
         </w:tc>
         <w:tc>
           <w:tcPr>
-            <w:tcW w:w="1478" w:type="dxa"/>
+            <w:tcW w:w="1479" w:type="dxa"/>
             <w:tcBorders>
               <w:top w:val="single" w:sz="4" w:space="0" w:color="F3F3F3"/>
               <w:start w:val="single" w:sz="4" w:space="0" w:color="F3F3F3"/>
@@ -3805,7 +3805,7 @@
         <w:trPr/>
         <w:tc>
           <w:tcPr>
-            <w:tcW w:w="4318" w:type="dxa"/>
+            <w:tcW w:w="4317" w:type="dxa"/>
             <w:tcBorders>
               <w:top w:val="single" w:sz="4" w:space="0" w:color="F3F3F3"/>
               <w:start w:val="single" w:sz="4" w:space="0" w:color="F3F3F3"/>
@@ -3869,7 +3869,7 @@
         </w:tc>
         <w:tc>
           <w:tcPr>
-            <w:tcW w:w="1478" w:type="dxa"/>
+            <w:tcW w:w="1479" w:type="dxa"/>
             <w:tcBorders>
               <w:top w:val="single" w:sz="4" w:space="0" w:color="F3F3F3"/>
               <w:start w:val="single" w:sz="4" w:space="0" w:color="F3F3F3"/>
@@ -3901,7 +3901,7 @@
         </w:tc>
         <w:tc>
           <w:tcPr>
-            <w:tcW w:w="1474" w:type="dxa"/>
+            <w:tcW w:w="1473" w:type="dxa"/>
             <w:tcBorders>
               <w:top w:val="single" w:sz="4" w:space="0" w:color="F3F3F3"/>
               <w:start w:val="single" w:sz="4" w:space="0" w:color="F3F3F3"/>
@@ -3933,7 +3933,7 @@
         </w:tc>
         <w:tc>
           <w:tcPr>
-            <w:tcW w:w="1478" w:type="dxa"/>
+            <w:tcW w:w="1479" w:type="dxa"/>
             <w:tcBorders>
               <w:top w:val="single" w:sz="4" w:space="0" w:color="F3F3F3"/>
               <w:start w:val="single" w:sz="4" w:space="0" w:color="F3F3F3"/>
@@ -3968,7 +3968,7 @@
         <w:trPr/>
         <w:tc>
           <w:tcPr>
-            <w:tcW w:w="4318" w:type="dxa"/>
+            <w:tcW w:w="4317" w:type="dxa"/>
             <w:tcBorders>
               <w:top w:val="single" w:sz="4" w:space="0" w:color="F3F3F3"/>
               <w:start w:val="single" w:sz="4" w:space="0" w:color="F3F3F3"/>
@@ -4032,7 +4032,7 @@
         </w:tc>
         <w:tc>
           <w:tcPr>
-            <w:tcW w:w="1478" w:type="dxa"/>
+            <w:tcW w:w="1479" w:type="dxa"/>
             <w:tcBorders>
               <w:top w:val="single" w:sz="4" w:space="0" w:color="F3F3F3"/>
               <w:start w:val="single" w:sz="4" w:space="0" w:color="F3F3F3"/>
@@ -4064,7 +4064,7 @@
         </w:tc>
         <w:tc>
           <w:tcPr>
-            <w:tcW w:w="1474" w:type="dxa"/>
+            <w:tcW w:w="1473" w:type="dxa"/>
             <w:tcBorders>
               <w:top w:val="single" w:sz="4" w:space="0" w:color="F3F3F3"/>
               <w:start w:val="single" w:sz="4" w:space="0" w:color="F3F3F3"/>
@@ -4096,7 +4096,7 @@
         </w:tc>
         <w:tc>
           <w:tcPr>
-            <w:tcW w:w="1478" w:type="dxa"/>
+            <w:tcW w:w="1479" w:type="dxa"/>
             <w:tcBorders>
               <w:top w:val="single" w:sz="4" w:space="0" w:color="F3F3F3"/>
               <w:start w:val="single" w:sz="4" w:space="0" w:color="F3F3F3"/>
@@ -4131,7 +4131,7 @@
         <w:trPr/>
         <w:tc>
           <w:tcPr>
-            <w:tcW w:w="4318" w:type="dxa"/>
+            <w:tcW w:w="4317" w:type="dxa"/>
             <w:tcBorders>
               <w:top w:val="single" w:sz="4" w:space="0" w:color="F3F3F3"/>
               <w:start w:val="single" w:sz="4" w:space="0" w:color="F3F3F3"/>
@@ -4195,7 +4195,7 @@
         </w:tc>
         <w:tc>
           <w:tcPr>
-            <w:tcW w:w="1478" w:type="dxa"/>
+            <w:tcW w:w="1479" w:type="dxa"/>
             <w:tcBorders>
               <w:top w:val="single" w:sz="4" w:space="0" w:color="F3F3F3"/>
               <w:start w:val="single" w:sz="4" w:space="0" w:color="F3F3F3"/>
@@ -4227,7 +4227,7 @@
         </w:tc>
         <w:tc>
           <w:tcPr>
-            <w:tcW w:w="1474" w:type="dxa"/>
+            <w:tcW w:w="1473" w:type="dxa"/>
             <w:tcBorders>
               <w:top w:val="single" w:sz="4" w:space="0" w:color="F3F3F3"/>
               <w:start w:val="single" w:sz="4" w:space="0" w:color="F3F3F3"/>
@@ -4259,7 +4259,7 @@
         </w:tc>
         <w:tc>
           <w:tcPr>
-            <w:tcW w:w="1478" w:type="dxa"/>
+            <w:tcW w:w="1479" w:type="dxa"/>
             <w:tcBorders>
               <w:top w:val="single" w:sz="4" w:space="0" w:color="F3F3F3"/>
               <w:start w:val="single" w:sz="4" w:space="0" w:color="F3F3F3"/>
@@ -4294,7 +4294,7 @@
         <w:trPr/>
         <w:tc>
           <w:tcPr>
-            <w:tcW w:w="4318" w:type="dxa"/>
+            <w:tcW w:w="4317" w:type="dxa"/>
             <w:tcBorders>
               <w:top w:val="single" w:sz="4" w:space="0" w:color="F3F3F3"/>
               <w:start w:val="single" w:sz="4" w:space="0" w:color="F3F3F3"/>
@@ -4358,7 +4358,7 @@
         </w:tc>
         <w:tc>
           <w:tcPr>
-            <w:tcW w:w="1478" w:type="dxa"/>
+            <w:tcW w:w="1479" w:type="dxa"/>
             <w:tcBorders>
               <w:top w:val="single" w:sz="4" w:space="0" w:color="F3F3F3"/>
               <w:start w:val="single" w:sz="4" w:space="0" w:color="F3F3F3"/>
@@ -4390,7 +4390,7 @@
         </w:tc>
         <w:tc>
           <w:tcPr>
-            <w:tcW w:w="1474" w:type="dxa"/>
+            <w:tcW w:w="1473" w:type="dxa"/>
             <w:tcBorders>
               <w:top w:val="single" w:sz="4" w:space="0" w:color="F3F3F3"/>
               <w:start w:val="single" w:sz="4" w:space="0" w:color="F3F3F3"/>
@@ -4422,7 +4422,7 @@
         </w:tc>
         <w:tc>
           <w:tcPr>
-            <w:tcW w:w="1478" w:type="dxa"/>
+            <w:tcW w:w="1479" w:type="dxa"/>
             <w:tcBorders>
               <w:top w:val="single" w:sz="4" w:space="0" w:color="F3F3F3"/>
               <w:start w:val="single" w:sz="4" w:space="0" w:color="F3F3F3"/>
@@ -4457,7 +4457,7 @@
         <w:trPr/>
         <w:tc>
           <w:tcPr>
-            <w:tcW w:w="4318" w:type="dxa"/>
+            <w:tcW w:w="4317" w:type="dxa"/>
             <w:tcBorders>
               <w:top w:val="single" w:sz="4" w:space="0" w:color="F3F3F3"/>
               <w:start w:val="single" w:sz="4" w:space="0" w:color="F3F3F3"/>
@@ -4521,7 +4521,7 @@
         </w:tc>
         <w:tc>
           <w:tcPr>
-            <w:tcW w:w="1478" w:type="dxa"/>
+            <w:tcW w:w="1479" w:type="dxa"/>
             <w:tcBorders>
               <w:top w:val="single" w:sz="4" w:space="0" w:color="F3F3F3"/>
               <w:start w:val="single" w:sz="4" w:space="0" w:color="F3F3F3"/>
@@ -4553,7 +4553,7 @@
         </w:tc>
         <w:tc>
           <w:tcPr>
-            <w:tcW w:w="1474" w:type="dxa"/>
+            <w:tcW w:w="1473" w:type="dxa"/>
             <w:tcBorders>
               <w:top w:val="single" w:sz="4" w:space="0" w:color="F3F3F3"/>
               <w:start w:val="single" w:sz="4" w:space="0" w:color="F3F3F3"/>
@@ -4585,7 +4585,7 @@
         </w:tc>
         <w:tc>
           <w:tcPr>
-            <w:tcW w:w="1478" w:type="dxa"/>
+            <w:tcW w:w="1479" w:type="dxa"/>
             <w:tcBorders>
               <w:top w:val="single" w:sz="4" w:space="0" w:color="F3F3F3"/>
               <w:start w:val="single" w:sz="4" w:space="0" w:color="F3F3F3"/>
@@ -4620,7 +4620,7 @@
         <w:trPr/>
         <w:tc>
           <w:tcPr>
-            <w:tcW w:w="4318" w:type="dxa"/>
+            <w:tcW w:w="4317" w:type="dxa"/>
             <w:tcBorders>
               <w:top w:val="single" w:sz="4" w:space="0" w:color="F3F3F3"/>
               <w:start w:val="single" w:sz="4" w:space="0" w:color="F3F3F3"/>
@@ -4684,7 +4684,7 @@
         </w:tc>
         <w:tc>
           <w:tcPr>
-            <w:tcW w:w="1478" w:type="dxa"/>
+            <w:tcW w:w="1479" w:type="dxa"/>
             <w:tcBorders>
               <w:top w:val="single" w:sz="4" w:space="0" w:color="F3F3F3"/>
               <w:start w:val="single" w:sz="4" w:space="0" w:color="F3F3F3"/>
@@ -4716,7 +4716,7 @@
         </w:tc>
         <w:tc>
           <w:tcPr>
-            <w:tcW w:w="1474" w:type="dxa"/>
+            <w:tcW w:w="1473" w:type="dxa"/>
             <w:tcBorders>
               <w:top w:val="single" w:sz="4" w:space="0" w:color="F3F3F3"/>
               <w:start w:val="single" w:sz="4" w:space="0" w:color="F3F3F3"/>
@@ -4748,7 +4748,7 @@
         </w:tc>
         <w:tc>
           <w:tcPr>
-            <w:tcW w:w="1478" w:type="dxa"/>
+            <w:tcW w:w="1479" w:type="dxa"/>
             <w:tcBorders>
               <w:top w:val="single" w:sz="4" w:space="0" w:color="F3F3F3"/>
               <w:start w:val="single" w:sz="4" w:space="0" w:color="F3F3F3"/>
@@ -4783,7 +4783,7 @@
         <w:trPr/>
         <w:tc>
           <w:tcPr>
-            <w:tcW w:w="4318" w:type="dxa"/>
+            <w:tcW w:w="4317" w:type="dxa"/>
             <w:tcBorders>
               <w:top w:val="single" w:sz="4" w:space="0" w:color="F3F3F3"/>
               <w:start w:val="single" w:sz="4" w:space="0" w:color="F3F3F3"/>
@@ -4850,7 +4850,7 @@
         </w:tc>
         <w:tc>
           <w:tcPr>
-            <w:tcW w:w="1478" w:type="dxa"/>
+            <w:tcW w:w="1479" w:type="dxa"/>
             <w:tcBorders>
               <w:top w:val="single" w:sz="4" w:space="0" w:color="F3F3F3"/>
               <w:start w:val="single" w:sz="4" w:space="0" w:color="F3F3F3"/>
@@ -4884,7 +4884,7 @@
         </w:tc>
         <w:tc>
           <w:tcPr>
-            <w:tcW w:w="1474" w:type="dxa"/>
+            <w:tcW w:w="1473" w:type="dxa"/>
             <w:tcBorders>
               <w:top w:val="single" w:sz="4" w:space="0" w:color="F3F3F3"/>
               <w:start w:val="single" w:sz="4" w:space="0" w:color="F3F3F3"/>
@@ -4917,7 +4917,7 @@
         </w:tc>
         <w:tc>
           <w:tcPr>
-            <w:tcW w:w="1478" w:type="dxa"/>
+            <w:tcW w:w="1479" w:type="dxa"/>
             <w:tcBorders>
               <w:top w:val="single" w:sz="4" w:space="0" w:color="F3F3F3"/>
               <w:start w:val="single" w:sz="4" w:space="0" w:color="F3F3F3"/>
@@ -5075,9 +5075,9 @@
             </w:tblPr>
             <w:tblGrid>
               <w:gridCol w:w="1760"/>
-              <w:gridCol w:w="2458"/>
+              <w:gridCol w:w="2457"/>
               <w:gridCol w:w="1940"/>
-              <w:gridCol w:w="1921"/>
+              <w:gridCol w:w="1922"/>
               <w:gridCol w:w="2089"/>
             </w:tblGrid>
             <w:tr>
@@ -5113,7 +5113,7 @@
               </w:tc>
               <w:tc>
                 <w:tcPr>
-                  <w:tcW w:w="2458" w:type="dxa"/>
+                  <w:tcW w:w="2457" w:type="dxa"/>
                   <w:tcBorders/>
                   <w:shd w:fill="auto" w:val="clear"/>
                 </w:tcPr>
@@ -5169,7 +5169,7 @@
               </w:tc>
               <w:tc>
                 <w:tcPr>
-                  <w:tcW w:w="1921" w:type="dxa"/>
+                  <w:tcW w:w="1922" w:type="dxa"/>
                   <w:tcBorders/>
                   <w:shd w:fill="auto" w:val="clear"/>
                   <w:tcMar>
@@ -5294,7 +5294,7 @@
               </w:tc>
               <w:tc>
                 <w:tcPr>
-                  <w:tcW w:w="2458" w:type="dxa"/>
+                  <w:tcW w:w="2457" w:type="dxa"/>
                   <w:tcBorders/>
                   <w:shd w:fill="auto" w:val="clear"/>
                 </w:tcPr>
@@ -5350,7 +5350,7 @@
               </w:tc>
               <w:tc>
                 <w:tcPr>
-                  <w:tcW w:w="1921" w:type="dxa"/>
+                  <w:tcW w:w="1922" w:type="dxa"/>
                   <w:tcBorders/>
                   <w:shd w:fill="auto" w:val="clear"/>
                   <w:tcMar>
@@ -5878,11 +5878,11 @@
             </w:tblPr>
             <w:tblGrid>
               <w:gridCol w:w="2415"/>
-              <w:gridCol w:w="238"/>
+              <w:gridCol w:w="237"/>
               <w:gridCol w:w="2115"/>
-              <w:gridCol w:w="257"/>
-              <w:gridCol w:w="1918"/>
-              <w:gridCol w:w="242"/>
+              <w:gridCol w:w="258"/>
+              <w:gridCol w:w="1917"/>
+              <w:gridCol w:w="243"/>
               <w:gridCol w:w="2955"/>
             </w:tblGrid>
             <w:tr>
@@ -5891,7 +5891,7 @@
               </w:trPr>
               <w:tc>
                 <w:tcPr>
-                  <w:tcW w:w="4768" w:type="dxa"/>
+                  <w:tcW w:w="4767" w:type="dxa"/>
                   <w:gridSpan w:val="3"/>
                   <w:tcBorders/>
                   <w:shd w:fill="EFEFEF" w:val="clear"/>
@@ -5919,7 +5919,7 @@
               </w:tc>
               <w:tc>
                 <w:tcPr>
-                  <w:tcW w:w="257" w:type="dxa"/>
+                  <w:tcW w:w="258" w:type="dxa"/>
                   <w:tcBorders/>
                   <w:shd w:fill="auto" w:val="clear"/>
                 </w:tcPr>
@@ -5998,7 +5998,7 @@
               </w:tc>
               <w:tc>
                 <w:tcPr>
-                  <w:tcW w:w="238" w:type="dxa"/>
+                  <w:tcW w:w="237" w:type="dxa"/>
                   <w:tcBorders/>
                   <w:shd w:fill="auto" w:val="clear"/>
                 </w:tcPr>
@@ -6048,7 +6048,7 @@
               </w:tc>
               <w:tc>
                 <w:tcPr>
-                  <w:tcW w:w="257" w:type="dxa"/>
+                  <w:tcW w:w="258" w:type="dxa"/>
                   <w:tcBorders/>
                   <w:shd w:fill="auto" w:val="clear"/>
                 </w:tcPr>
@@ -6072,7 +6072,7 @@
               </w:tc>
               <w:tc>
                 <w:tcPr>
-                  <w:tcW w:w="1918" w:type="dxa"/>
+                  <w:tcW w:w="1917" w:type="dxa"/>
                   <w:tcBorders/>
                   <w:shd w:fill="auto" w:val="clear"/>
                 </w:tcPr>
@@ -6097,7 +6097,7 @@
               </w:tc>
               <w:tc>
                 <w:tcPr>
-                  <w:tcW w:w="242" w:type="dxa"/>
+                  <w:tcW w:w="243" w:type="dxa"/>
                   <w:tcBorders/>
                   <w:shd w:fill="auto" w:val="clear"/>
                 </w:tcPr>
@@ -6175,7 +6175,7 @@
               </w:tc>
               <w:tc>
                 <w:tcPr>
-                  <w:tcW w:w="238" w:type="dxa"/>
+                  <w:tcW w:w="237" w:type="dxa"/>
                   <w:tcBorders/>
                   <w:shd w:fill="auto" w:val="clear"/>
                 </w:tcPr>
@@ -6225,7 +6225,7 @@
               </w:tc>
               <w:tc>
                 <w:tcPr>
-                  <w:tcW w:w="257" w:type="dxa"/>
+                  <w:tcW w:w="258" w:type="dxa"/>
                   <w:tcBorders/>
                   <w:shd w:fill="auto" w:val="clear"/>
                 </w:tcPr>
@@ -6249,7 +6249,7 @@
               </w:tc>
               <w:tc>
                 <w:tcPr>
-                  <w:tcW w:w="1918" w:type="dxa"/>
+                  <w:tcW w:w="1917" w:type="dxa"/>
                   <w:tcBorders/>
                   <w:shd w:fill="auto" w:val="clear"/>
                 </w:tcPr>
@@ -6274,7 +6274,7 @@
               </w:tc>
               <w:tc>
                 <w:tcPr>
-                  <w:tcW w:w="242" w:type="dxa"/>
+                  <w:tcW w:w="243" w:type="dxa"/>
                   <w:tcBorders/>
                   <w:shd w:fill="auto" w:val="clear"/>
                 </w:tcPr>
@@ -6352,7 +6352,7 @@
               </w:tc>
               <w:tc>
                 <w:tcPr>
-                  <w:tcW w:w="238" w:type="dxa"/>
+                  <w:tcW w:w="237" w:type="dxa"/>
                   <w:tcBorders/>
                   <w:shd w:fill="auto" w:val="clear"/>
                 </w:tcPr>
@@ -6402,7 +6402,7 @@
               </w:tc>
               <w:tc>
                 <w:tcPr>
-                  <w:tcW w:w="257" w:type="dxa"/>
+                  <w:tcW w:w="258" w:type="dxa"/>
                   <w:tcBorders/>
                   <w:shd w:fill="auto" w:val="clear"/>
                 </w:tcPr>
@@ -6426,7 +6426,7 @@
               </w:tc>
               <w:tc>
                 <w:tcPr>
-                  <w:tcW w:w="1918" w:type="dxa"/>
+                  <w:tcW w:w="1917" w:type="dxa"/>
                   <w:tcBorders/>
                   <w:shd w:fill="auto" w:val="clear"/>
                 </w:tcPr>
@@ -6451,7 +6451,7 @@
               </w:tc>
               <w:tc>
                 <w:tcPr>
-                  <w:tcW w:w="242" w:type="dxa"/>
+                  <w:tcW w:w="243" w:type="dxa"/>
                   <w:tcBorders/>
                   <w:shd w:fill="auto" w:val="clear"/>
                 </w:tcPr>
@@ -6528,7 +6528,7 @@
               </w:tc>
               <w:tc>
                 <w:tcPr>
-                  <w:tcW w:w="238" w:type="dxa"/>
+                  <w:tcW w:w="237" w:type="dxa"/>
                   <w:tcBorders/>
                   <w:shd w:fill="auto" w:val="clear"/>
                 </w:tcPr>
@@ -6577,7 +6577,7 @@
               </w:tc>
               <w:tc>
                 <w:tcPr>
-                  <w:tcW w:w="257" w:type="dxa"/>
+                  <w:tcW w:w="258" w:type="dxa"/>
                   <w:tcBorders/>
                   <w:shd w:fill="auto" w:val="clear"/>
                 </w:tcPr>
@@ -6601,7 +6601,7 @@
               </w:tc>
               <w:tc>
                 <w:tcPr>
-                  <w:tcW w:w="1918" w:type="dxa"/>
+                  <w:tcW w:w="1917" w:type="dxa"/>
                   <w:tcBorders/>
                   <w:shd w:fill="auto" w:val="clear"/>
                 </w:tcPr>
@@ -6628,7 +6628,7 @@
               </w:tc>
               <w:tc>
                 <w:tcPr>
-                  <w:tcW w:w="242" w:type="dxa"/>
+                  <w:tcW w:w="243" w:type="dxa"/>
                   <w:tcBorders/>
                   <w:shd w:fill="auto" w:val="clear"/>
                 </w:tcPr>
@@ -6882,11 +6882,11 @@
             </w:tblPr>
             <w:tblGrid>
               <w:gridCol w:w="2415"/>
-              <w:gridCol w:w="238"/>
+              <w:gridCol w:w="237"/>
               <w:gridCol w:w="2115"/>
-              <w:gridCol w:w="257"/>
-              <w:gridCol w:w="1918"/>
-              <w:gridCol w:w="242"/>
+              <w:gridCol w:w="258"/>
+              <w:gridCol w:w="1917"/>
+              <w:gridCol w:w="243"/>
               <w:gridCol w:w="2955"/>
             </w:tblGrid>
             <w:tr>
@@ -6895,7 +6895,7 @@
               </w:trPr>
               <w:tc>
                 <w:tcPr>
-                  <w:tcW w:w="4768" w:type="dxa"/>
+                  <w:tcW w:w="4767" w:type="dxa"/>
                   <w:gridSpan w:val="3"/>
                   <w:tcBorders/>
                   <w:shd w:fill="EFEFEF" w:val="clear"/>
@@ -6923,7 +6923,7 @@
               </w:tc>
               <w:tc>
                 <w:tcPr>
-                  <w:tcW w:w="257" w:type="dxa"/>
+                  <w:tcW w:w="258" w:type="dxa"/>
                   <w:tcBorders/>
                   <w:shd w:fill="auto" w:val="clear"/>
                 </w:tcPr>
@@ -7002,7 +7002,7 @@
               </w:tc>
               <w:tc>
                 <w:tcPr>
-                  <w:tcW w:w="238" w:type="dxa"/>
+                  <w:tcW w:w="237" w:type="dxa"/>
                   <w:tcBorders/>
                   <w:shd w:fill="auto" w:val="clear"/>
                 </w:tcPr>
@@ -7052,7 +7052,7 @@
               </w:tc>
               <w:tc>
                 <w:tcPr>
-                  <w:tcW w:w="257" w:type="dxa"/>
+                  <w:tcW w:w="258" w:type="dxa"/>
                   <w:tcBorders/>
                   <w:shd w:fill="auto" w:val="clear"/>
                 </w:tcPr>
@@ -7076,7 +7076,7 @@
               </w:tc>
               <w:tc>
                 <w:tcPr>
-                  <w:tcW w:w="1918" w:type="dxa"/>
+                  <w:tcW w:w="1917" w:type="dxa"/>
                   <w:tcBorders/>
                   <w:shd w:fill="auto" w:val="clear"/>
                 </w:tcPr>
@@ -7101,7 +7101,7 @@
               </w:tc>
               <w:tc>
                 <w:tcPr>
-                  <w:tcW w:w="242" w:type="dxa"/>
+                  <w:tcW w:w="243" w:type="dxa"/>
                   <w:tcBorders/>
                   <w:shd w:fill="auto" w:val="clear"/>
                 </w:tcPr>
@@ -7179,7 +7179,7 @@
               </w:tc>
               <w:tc>
                 <w:tcPr>
-                  <w:tcW w:w="238" w:type="dxa"/>
+                  <w:tcW w:w="237" w:type="dxa"/>
                   <w:tcBorders/>
                   <w:shd w:fill="auto" w:val="clear"/>
                 </w:tcPr>
@@ -7229,7 +7229,7 @@
               </w:tc>
               <w:tc>
                 <w:tcPr>
-                  <w:tcW w:w="257" w:type="dxa"/>
+                  <w:tcW w:w="258" w:type="dxa"/>
                   <w:tcBorders/>
                   <w:shd w:fill="auto" w:val="clear"/>
                 </w:tcPr>
@@ -7253,7 +7253,7 @@
               </w:tc>
               <w:tc>
                 <w:tcPr>
-                  <w:tcW w:w="1918" w:type="dxa"/>
+                  <w:tcW w:w="1917" w:type="dxa"/>
                   <w:tcBorders/>
                   <w:shd w:fill="auto" w:val="clear"/>
                 </w:tcPr>
@@ -7278,7 +7278,7 @@
               </w:tc>
               <w:tc>
                 <w:tcPr>
-                  <w:tcW w:w="242" w:type="dxa"/>
+                  <w:tcW w:w="243" w:type="dxa"/>
                   <w:tcBorders/>
                   <w:shd w:fill="auto" w:val="clear"/>
                 </w:tcPr>
@@ -7356,7 +7356,7 @@
               </w:tc>
               <w:tc>
                 <w:tcPr>
-                  <w:tcW w:w="238" w:type="dxa"/>
+                  <w:tcW w:w="237" w:type="dxa"/>
                   <w:tcBorders/>
                   <w:shd w:fill="auto" w:val="clear"/>
                 </w:tcPr>
@@ -7406,7 +7406,7 @@
               </w:tc>
               <w:tc>
                 <w:tcPr>
-                  <w:tcW w:w="257" w:type="dxa"/>
+                  <w:tcW w:w="258" w:type="dxa"/>
                   <w:tcBorders/>
                   <w:shd w:fill="auto" w:val="clear"/>
                 </w:tcPr>
@@ -7430,7 +7430,7 @@
               </w:tc>
               <w:tc>
                 <w:tcPr>
-                  <w:tcW w:w="1918" w:type="dxa"/>
+                  <w:tcW w:w="1917" w:type="dxa"/>
                   <w:tcBorders/>
                   <w:shd w:fill="auto" w:val="clear"/>
                 </w:tcPr>
@@ -7455,7 +7455,7 @@
               </w:tc>
               <w:tc>
                 <w:tcPr>
-                  <w:tcW w:w="242" w:type="dxa"/>
+                  <w:tcW w:w="243" w:type="dxa"/>
                   <w:tcBorders/>
                   <w:shd w:fill="auto" w:val="clear"/>
                 </w:tcPr>
@@ -7532,7 +7532,7 @@
               </w:tc>
               <w:tc>
                 <w:tcPr>
-                  <w:tcW w:w="238" w:type="dxa"/>
+                  <w:tcW w:w="237" w:type="dxa"/>
                   <w:tcBorders/>
                   <w:shd w:fill="auto" w:val="clear"/>
                 </w:tcPr>
@@ -7581,7 +7581,7 @@
               </w:tc>
               <w:tc>
                 <w:tcPr>
-                  <w:tcW w:w="257" w:type="dxa"/>
+                  <w:tcW w:w="258" w:type="dxa"/>
                   <w:tcBorders/>
                   <w:shd w:fill="auto" w:val="clear"/>
                 </w:tcPr>
@@ -7605,7 +7605,7 @@
               </w:tc>
               <w:tc>
                 <w:tcPr>
-                  <w:tcW w:w="1918" w:type="dxa"/>
+                  <w:tcW w:w="1917" w:type="dxa"/>
                   <w:tcBorders/>
                   <w:shd w:fill="auto" w:val="clear"/>
                 </w:tcPr>
@@ -7632,7 +7632,7 @@
               </w:tc>
               <w:tc>
                 <w:tcPr>
-                  <w:tcW w:w="242" w:type="dxa"/>
+                  <w:tcW w:w="243" w:type="dxa"/>
                   <w:tcBorders/>
                   <w:shd w:fill="auto" w:val="clear"/>
                 </w:tcPr>
@@ -8561,8 +8561,8 @@
     </w:p>
     <w:tbl>
       <w:tblPr>
-        <w:tblStyle w:val="Table23"/>
-        <w:tblW w:w="9960" w:type="dxa"/>
+        <w:tblStyle w:val="Table24"/>
+        <w:tblW w:w="9810" w:type="dxa"/>
         <w:jc w:val="start"/>
         <w:tblInd w:w="255" w:type="dxa"/>
         <w:tblLayout w:type="fixed"/>
@@ -8575,113 +8575,13 @@
         <w:tblLook w:val="0600"/>
       </w:tblPr>
       <w:tblGrid>
-        <w:gridCol w:w="9960"/>
+        <w:gridCol w:w="9810"/>
       </w:tblGrid>
       <w:tr>
         <w:trPr/>
         <w:tc>
           <w:tcPr>
-            <w:tcW w:w="9960" w:type="dxa"/>
-            <w:tcBorders/>
-            <w:shd w:fill="auto" w:val="clear"/>
-          </w:tcPr>
-          <w:p>
-            <w:pPr>
-              <w:pStyle w:val="normal1"/>
-              <w:rPr>
-                <w:rFonts w:ascii="Calibri" w:hAnsi="Calibri" w:eastAsia="Calibri" w:cs="Calibri"/>
-                <w:sz w:val="12"/>
-                <w:szCs w:val="12"/>
-              </w:rPr>
-            </w:pPr>
-            <w:r>
-              <w:rPr>
-                <w:rFonts w:eastAsia="Open Sans" w:cs="Open Sans" w:ascii="Open Sans" w:hAnsi="Open Sans"/>
-                <w:color w:val="FFFFFF"/>
-                <w:sz w:val="12"/>
-                <w:szCs w:val="12"/>
-              </w:rPr>
-              <w:t xml:space="preserve"> </w:t>
-            </w:r>
-            <w:r>
-              <w:rPr>
-                <w:rFonts w:eastAsia="Open Sans" w:cs="Open Sans" w:ascii="Open Sans" w:hAnsi="Open Sans"/>
-                <w:color w:val="FFFFFF"/>
-                <w:sz w:val="12"/>
-                <w:szCs w:val="12"/>
-              </w:rPr>
-              <w:t>Industria Works LLC</w:t>
-            </w:r>
-          </w:p>
-          <w:p>
-            <w:pPr>
-              <w:pStyle w:val="normal1"/>
-              <w:spacing w:lineRule="auto" w:line="240" w:before="0" w:after="0"/>
-              <w:rPr>
-                <w:rFonts w:ascii="Calibri" w:hAnsi="Calibri" w:eastAsia="Calibri" w:cs="Calibri"/>
-                <w:sz w:val="2"/>
-                <w:szCs w:val="2"/>
-              </w:rPr>
-            </w:pPr>
-            <w:r>
-              <w:rPr>
-                <w:rFonts w:eastAsia="Calibri" w:cs="Calibri" w:ascii="Calibri" w:hAnsi="Calibri"/>
-                <w:sz w:val="2"/>
-                <w:szCs w:val="2"/>
-              </w:rPr>
-            </w:r>
-          </w:p>
-        </w:tc>
-      </w:tr>
-    </w:tbl>
-    <w:p>
-      <w:pPr>
-        <w:pStyle w:val="normal1"/>
-        <w:keepNext w:val="false"/>
-        <w:keepLines w:val="false"/>
-        <w:pageBreakBefore w:val="false"/>
-        <w:widowControl w:val="false"/>
-        <w:shd w:val="clear" w:fill="auto"/>
-        <w:spacing w:lineRule="auto" w:line="276" w:before="0" w:after="0"/>
-        <w:ind w:hanging="0" w:start="0" w:end="0"/>
-        <w:jc w:val="start"/>
-        <w:rPr>
-          <w:rFonts w:ascii="Calibri" w:hAnsi="Calibri" w:eastAsia="Calibri" w:cs="Calibri"/>
-          <w:sz w:val="20"/>
-          <w:szCs w:val="20"/>
-        </w:rPr>
-      </w:pPr>
-      <w:r>
-        <w:rPr>
-          <w:rFonts w:eastAsia="Calibri" w:cs="Calibri" w:ascii="Calibri" w:hAnsi="Calibri"/>
-          <w:sz w:val="20"/>
-          <w:szCs w:val="20"/>
-        </w:rPr>
-      </w:r>
-    </w:p>
-    <w:tbl>
-      <w:tblPr>
-        <w:tblStyle w:val="Table24"/>
-        <w:tblW w:w="9960" w:type="dxa"/>
-        <w:jc w:val="start"/>
-        <w:tblInd w:w="255" w:type="dxa"/>
-        <w:tblLayout w:type="fixed"/>
-        <w:tblCellMar>
-          <w:top w:w="0" w:type="dxa"/>
-          <w:start w:w="0" w:type="dxa"/>
-          <w:bottom w:w="0" w:type="dxa"/>
-          <w:end w:w="0" w:type="dxa"/>
-        </w:tblCellMar>
-        <w:tblLook w:val="0600"/>
-      </w:tblPr>
-      <w:tblGrid>
-        <w:gridCol w:w="9960"/>
-      </w:tblGrid>
-      <w:tr>
-        <w:trPr/>
-        <w:tc>
-          <w:tcPr>
-            <w:tcW w:w="9960" w:type="dxa"/>
+            <w:tcW w:w="9810" w:type="dxa"/>
             <w:tcBorders/>
             <w:shd w:fill="auto" w:val="clear"/>
           </w:tcPr>
@@ -8749,6 +8649,8 @@
                     <w:ind w:hanging="0" w:start="42"/>
                     <w:rPr>
                       <w:rFonts w:ascii="Calibri" w:hAnsi="Calibri" w:eastAsia="Calibri" w:cs="Calibri"/>
+                      <w:b/>
+                      <w:bCs/>
                       <w:sz w:val="20"/>
                       <w:szCs w:val="20"/>
                     </w:rPr>
@@ -8756,9 +8658,12 @@
                   <w:r>
                     <w:rPr>
                       <w:rFonts w:eastAsia="Calibri" w:cs="Calibri" w:ascii="Calibri" w:hAnsi="Calibri"/>
-                      <w:sz w:val="20"/>
-                      <w:szCs w:val="20"/>
-                    </w:rPr>
+                      <w:b/>
+                      <w:bCs/>
+                      <w:sz w:val="20"/>
+                      <w:szCs w:val="20"/>
+                    </w:rPr>
+                    <w:t xml:space="preserve">Production: </w:t>
                   </w:r>
                 </w:p>
               </w:tc>
@@ -8781,6 +8686,8 @@
                     <w:ind w:hanging="0" w:start="42"/>
                     <w:rPr>
                       <w:rFonts w:ascii="Calibri" w:hAnsi="Calibri" w:eastAsia="Calibri" w:cs="Calibri"/>
+                      <w:b/>
+                      <w:bCs/>
                       <w:sz w:val="20"/>
                       <w:szCs w:val="20"/>
                     </w:rPr>
@@ -8788,9 +8695,12 @@
                   <w:r>
                     <w:rPr>
                       <w:rFonts w:eastAsia="Calibri" w:cs="Calibri" w:ascii="Calibri" w:hAnsi="Calibri"/>
-                      <w:sz w:val="20"/>
-                      <w:szCs w:val="20"/>
-                    </w:rPr>
+                      <w:b/>
+                      <w:bCs/>
+                      <w:sz w:val="20"/>
+                      <w:szCs w:val="20"/>
+                    </w:rPr>
+                    <w:t xml:space="preserve">Catering: </w:t>
                   </w:r>
                 </w:p>
               </w:tc>
@@ -9323,18 +9233,29 @@
               <w:pStyle w:val="normal1"/>
               <w:ind w:hanging="0" w:start="0"/>
               <w:rPr>
-                <w:rFonts w:ascii="Calibri" w:hAnsi="Calibri" w:eastAsia="Calibri" w:cs="Calibri"/>
-                <w:sz w:val="20"/>
-                <w:szCs w:val="20"/>
+                <w:b/>
+                <w:bCs/>
               </w:rPr>
             </w:pPr>
             <w:r>
               <w:rPr>
                 <w:rFonts w:eastAsia="Calibri" w:cs="Calibri" w:ascii="Calibri" w:hAnsi="Calibri"/>
+                <w:b/>
+                <w:bCs/>
                 <w:sz w:val="20"/>
                 <w:szCs w:val="20"/>
               </w:rPr>
               <w:t xml:space="preserve"> </w:t>
+            </w:r>
+            <w:r>
+              <w:rPr>
+                <w:rFonts w:eastAsia="Calibri" w:cs="Calibri" w:ascii="Calibri" w:hAnsi="Calibri"/>
+                <w:b/>
+                <w:bCs/>
+                <w:sz w:val="20"/>
+                <w:szCs w:val="20"/>
+              </w:rPr>
+              <w:t xml:space="preserve">Special Provisions: </w:t>
             </w:r>
           </w:p>
           <w:p>
@@ -9948,6 +9869,8 @@
                     <w:ind w:hanging="0" w:start="57"/>
                     <w:rPr>
                       <w:rFonts w:ascii="Calibri" w:hAnsi="Calibri" w:eastAsia="Calibri" w:cs="Calibri"/>
+                      <w:b/>
+                      <w:bCs/>
                       <w:sz w:val="20"/>
                       <w:szCs w:val="20"/>
                     </w:rPr>
@@ -9955,9 +9878,12 @@
                   <w:r>
                     <w:rPr>
                       <w:rFonts w:eastAsia="Calibri" w:cs="Calibri" w:ascii="Calibri" w:hAnsi="Calibri"/>
-                      <w:sz w:val="20"/>
-                      <w:szCs w:val="20"/>
-                    </w:rPr>
+                      <w:b/>
+                      <w:bCs/>
+                      <w:sz w:val="20"/>
+                      <w:szCs w:val="20"/>
+                    </w:rPr>
+                    <w:t xml:space="preserve">Complimentary Tickets: </w:t>
                   </w:r>
                 </w:p>
               </w:tc>
@@ -10348,6 +10274,8 @@
               <w:ind w:hanging="0" w:start="0"/>
               <w:rPr>
                 <w:rFonts w:ascii="Calibri" w:hAnsi="Calibri" w:eastAsia="Calibri" w:cs="Calibri"/>
+                <w:b/>
+                <w:bCs/>
                 <w:sz w:val="20"/>
                 <w:szCs w:val="20"/>
               </w:rPr>
@@ -10355,9 +10283,12 @@
             <w:r>
               <w:rPr>
                 <w:rFonts w:eastAsia="Calibri" w:cs="Calibri" w:ascii="Calibri" w:hAnsi="Calibri"/>
-                <w:sz w:val="20"/>
-                <w:szCs w:val="20"/>
-              </w:rPr>
+                <w:b/>
+                <w:bCs/>
+                <w:sz w:val="20"/>
+                <w:szCs w:val="20"/>
+              </w:rPr>
+              <w:t xml:space="preserve">Additional Addenda: </w:t>
             </w:r>
           </w:p>
         </w:tc>
@@ -10611,14 +10542,14 @@
         <w:tblLook w:val="0600"/>
       </w:tblPr>
       <w:tblGrid>
-        <w:gridCol w:w="4693"/>
-        <w:gridCol w:w="5531"/>
+        <w:gridCol w:w="4692"/>
+        <w:gridCol w:w="5532"/>
       </w:tblGrid>
       <w:tr>
         <w:trPr/>
         <w:tc>
           <w:tcPr>
-            <w:tcW w:w="4693" w:type="dxa"/>
+            <w:tcW w:w="4692" w:type="dxa"/>
             <w:tcBorders/>
             <w:shd w:fill="auto" w:val="clear"/>
           </w:tcPr>
@@ -10821,7 +10752,7 @@
         </w:tc>
         <w:tc>
           <w:tcPr>
-            <w:tcW w:w="5531" w:type="dxa"/>
+            <w:tcW w:w="5532" w:type="dxa"/>
             <w:tcBorders/>
             <w:shd w:fill="auto" w:val="clear"/>
           </w:tcPr>

</xml_diff>

<commit_message>
Added more feedback changes
</commit_message>
<xml_diff>
--- a/templates/performance_multi.docx
+++ b/templates/performance_multi.docx
@@ -803,8 +803,8 @@
               <w:tblLook w:val="0600"/>
             </w:tblPr>
             <w:tblGrid>
-              <w:gridCol w:w="2577"/>
-              <w:gridCol w:w="7458"/>
+              <w:gridCol w:w="2574"/>
+              <w:gridCol w:w="7461"/>
             </w:tblGrid>
             <w:tr>
               <w:trPr>
@@ -902,7 +902,7 @@
               </w:trPr>
               <w:tc>
                 <w:tcPr>
-                  <w:tcW w:w="2577" w:type="dxa"/>
+                  <w:tcW w:w="2574" w:type="dxa"/>
                   <w:tcBorders>
                     <w:top w:val="single" w:sz="4" w:space="0" w:color="000000"/>
                     <w:start w:val="single" w:sz="4" w:space="0" w:color="000000"/>
@@ -996,7 +996,7 @@
               </w:tc>
               <w:tc>
                 <w:tcPr>
-                  <w:tcW w:w="7458" w:type="dxa"/>
+                  <w:tcW w:w="7461" w:type="dxa"/>
                   <w:tcBorders>
                     <w:top w:val="single" w:sz="4" w:space="0" w:color="000000"/>
                     <w:start w:val="single" w:sz="4" w:space="0" w:color="FFFFFF"/>
@@ -1303,8 +1303,8 @@
               <w:tblLook w:val="0600"/>
             </w:tblPr>
             <w:tblGrid>
-              <w:gridCol w:w="2577"/>
-              <w:gridCol w:w="7458"/>
+              <w:gridCol w:w="2574"/>
+              <w:gridCol w:w="7461"/>
             </w:tblGrid>
             <w:tr>
               <w:trPr>
@@ -1394,7 +1394,7 @@
               </w:trPr>
               <w:tc>
                 <w:tcPr>
-                  <w:tcW w:w="2577" w:type="dxa"/>
+                  <w:tcW w:w="2574" w:type="dxa"/>
                   <w:tcBorders>
                     <w:top w:val="single" w:sz="4" w:space="0" w:color="000000"/>
                     <w:start w:val="single" w:sz="4" w:space="0" w:color="000000"/>
@@ -1489,7 +1489,7 @@
               </w:tc>
               <w:tc>
                 <w:tcPr>
-                  <w:tcW w:w="7458" w:type="dxa"/>
+                  <w:tcW w:w="7461" w:type="dxa"/>
                   <w:tcBorders>
                     <w:top w:val="single" w:sz="4" w:space="0" w:color="000000"/>
                     <w:start w:val="single" w:sz="4" w:space="0" w:color="FFFFFF"/>
@@ -3067,9 +3067,9 @@
             </w:tblPr>
             <w:tblGrid>
               <w:gridCol w:w="1760"/>
-              <w:gridCol w:w="2457"/>
+              <w:gridCol w:w="2454"/>
               <w:gridCol w:w="1940"/>
-              <w:gridCol w:w="1922"/>
+              <w:gridCol w:w="1925"/>
               <w:gridCol w:w="2089"/>
             </w:tblGrid>
             <w:tr>
@@ -3105,7 +3105,7 @@
               </w:tc>
               <w:tc>
                 <w:tcPr>
-                  <w:tcW w:w="2457" w:type="dxa"/>
+                  <w:tcW w:w="2454" w:type="dxa"/>
                   <w:tcBorders/>
                   <w:shd w:fill="auto" w:val="clear"/>
                 </w:tcPr>
@@ -3161,7 +3161,7 @@
               </w:tc>
               <w:tc>
                 <w:tcPr>
-                  <w:tcW w:w="1922" w:type="dxa"/>
+                  <w:tcW w:w="1925" w:type="dxa"/>
                   <w:tcBorders/>
                   <w:shd w:fill="auto" w:val="clear"/>
                   <w:tcMar>
@@ -3286,7 +3286,7 @@
               </w:tc>
               <w:tc>
                 <w:tcPr>
-                  <w:tcW w:w="2457" w:type="dxa"/>
+                  <w:tcW w:w="2454" w:type="dxa"/>
                   <w:tcBorders/>
                   <w:shd w:fill="auto" w:val="clear"/>
                 </w:tcPr>
@@ -3342,7 +3342,7 @@
               </w:tc>
               <w:tc>
                 <w:tcPr>
-                  <w:tcW w:w="1922" w:type="dxa"/>
+                  <w:tcW w:w="1925" w:type="dxa"/>
                   <w:tcBorders/>
                   <w:shd w:fill="auto" w:val="clear"/>
                   <w:tcMar>
@@ -3621,11 +3621,11 @@
         <w:tblLook w:val="0600"/>
       </w:tblPr>
       <w:tblGrid>
-        <w:gridCol w:w="4317"/>
+        <w:gridCol w:w="4314"/>
         <w:gridCol w:w="1476"/>
-        <w:gridCol w:w="1479"/>
-        <w:gridCol w:w="1473"/>
-        <w:gridCol w:w="1479"/>
+        <w:gridCol w:w="1482"/>
+        <w:gridCol w:w="1470"/>
+        <w:gridCol w:w="1482"/>
       </w:tblGrid>
       <w:tr>
         <w:trPr>
@@ -3633,7 +3633,7 @@
         </w:trPr>
         <w:tc>
           <w:tcPr>
-            <w:tcW w:w="4317" w:type="dxa"/>
+            <w:tcW w:w="4314" w:type="dxa"/>
             <w:tcBorders>
               <w:top w:val="single" w:sz="4" w:space="0" w:color="F3F3F3"/>
               <w:start w:val="single" w:sz="4" w:space="0" w:color="F3F3F3"/>
@@ -3700,7 +3700,7 @@
         </w:tc>
         <w:tc>
           <w:tcPr>
-            <w:tcW w:w="1479" w:type="dxa"/>
+            <w:tcW w:w="1482" w:type="dxa"/>
             <w:tcBorders>
               <w:top w:val="single" w:sz="4" w:space="0" w:color="F3F3F3"/>
               <w:start w:val="single" w:sz="4" w:space="0" w:color="F3F3F3"/>
@@ -3734,7 +3734,7 @@
         </w:tc>
         <w:tc>
           <w:tcPr>
-            <w:tcW w:w="1473" w:type="dxa"/>
+            <w:tcW w:w="1470" w:type="dxa"/>
             <w:tcBorders>
               <w:top w:val="single" w:sz="4" w:space="0" w:color="F3F3F3"/>
               <w:start w:val="single" w:sz="4" w:space="0" w:color="F3F3F3"/>
@@ -3768,7 +3768,7 @@
         </w:tc>
         <w:tc>
           <w:tcPr>
-            <w:tcW w:w="1479" w:type="dxa"/>
+            <w:tcW w:w="1482" w:type="dxa"/>
             <w:tcBorders>
               <w:top w:val="single" w:sz="4" w:space="0" w:color="F3F3F3"/>
               <w:start w:val="single" w:sz="4" w:space="0" w:color="F3F3F3"/>
@@ -3805,7 +3805,7 @@
         <w:trPr/>
         <w:tc>
           <w:tcPr>
-            <w:tcW w:w="4317" w:type="dxa"/>
+            <w:tcW w:w="4314" w:type="dxa"/>
             <w:tcBorders>
               <w:top w:val="single" w:sz="4" w:space="0" w:color="F3F3F3"/>
               <w:start w:val="single" w:sz="4" w:space="0" w:color="F3F3F3"/>
@@ -3869,7 +3869,7 @@
         </w:tc>
         <w:tc>
           <w:tcPr>
-            <w:tcW w:w="1479" w:type="dxa"/>
+            <w:tcW w:w="1482" w:type="dxa"/>
             <w:tcBorders>
               <w:top w:val="single" w:sz="4" w:space="0" w:color="F3F3F3"/>
               <w:start w:val="single" w:sz="4" w:space="0" w:color="F3F3F3"/>
@@ -3901,7 +3901,7 @@
         </w:tc>
         <w:tc>
           <w:tcPr>
-            <w:tcW w:w="1473" w:type="dxa"/>
+            <w:tcW w:w="1470" w:type="dxa"/>
             <w:tcBorders>
               <w:top w:val="single" w:sz="4" w:space="0" w:color="F3F3F3"/>
               <w:start w:val="single" w:sz="4" w:space="0" w:color="F3F3F3"/>
@@ -3933,7 +3933,7 @@
         </w:tc>
         <w:tc>
           <w:tcPr>
-            <w:tcW w:w="1479" w:type="dxa"/>
+            <w:tcW w:w="1482" w:type="dxa"/>
             <w:tcBorders>
               <w:top w:val="single" w:sz="4" w:space="0" w:color="F3F3F3"/>
               <w:start w:val="single" w:sz="4" w:space="0" w:color="F3F3F3"/>
@@ -3968,7 +3968,7 @@
         <w:trPr/>
         <w:tc>
           <w:tcPr>
-            <w:tcW w:w="4317" w:type="dxa"/>
+            <w:tcW w:w="4314" w:type="dxa"/>
             <w:tcBorders>
               <w:top w:val="single" w:sz="4" w:space="0" w:color="F3F3F3"/>
               <w:start w:val="single" w:sz="4" w:space="0" w:color="F3F3F3"/>
@@ -4032,7 +4032,7 @@
         </w:tc>
         <w:tc>
           <w:tcPr>
-            <w:tcW w:w="1479" w:type="dxa"/>
+            <w:tcW w:w="1482" w:type="dxa"/>
             <w:tcBorders>
               <w:top w:val="single" w:sz="4" w:space="0" w:color="F3F3F3"/>
               <w:start w:val="single" w:sz="4" w:space="0" w:color="F3F3F3"/>
@@ -4064,7 +4064,7 @@
         </w:tc>
         <w:tc>
           <w:tcPr>
-            <w:tcW w:w="1473" w:type="dxa"/>
+            <w:tcW w:w="1470" w:type="dxa"/>
             <w:tcBorders>
               <w:top w:val="single" w:sz="4" w:space="0" w:color="F3F3F3"/>
               <w:start w:val="single" w:sz="4" w:space="0" w:color="F3F3F3"/>
@@ -4096,7 +4096,7 @@
         </w:tc>
         <w:tc>
           <w:tcPr>
-            <w:tcW w:w="1479" w:type="dxa"/>
+            <w:tcW w:w="1482" w:type="dxa"/>
             <w:tcBorders>
               <w:top w:val="single" w:sz="4" w:space="0" w:color="F3F3F3"/>
               <w:start w:val="single" w:sz="4" w:space="0" w:color="F3F3F3"/>
@@ -4131,7 +4131,7 @@
         <w:trPr/>
         <w:tc>
           <w:tcPr>
-            <w:tcW w:w="4317" w:type="dxa"/>
+            <w:tcW w:w="4314" w:type="dxa"/>
             <w:tcBorders>
               <w:top w:val="single" w:sz="4" w:space="0" w:color="F3F3F3"/>
               <w:start w:val="single" w:sz="4" w:space="0" w:color="F3F3F3"/>
@@ -4195,7 +4195,7 @@
         </w:tc>
         <w:tc>
           <w:tcPr>
-            <w:tcW w:w="1479" w:type="dxa"/>
+            <w:tcW w:w="1482" w:type="dxa"/>
             <w:tcBorders>
               <w:top w:val="single" w:sz="4" w:space="0" w:color="F3F3F3"/>
               <w:start w:val="single" w:sz="4" w:space="0" w:color="F3F3F3"/>
@@ -4227,7 +4227,7 @@
         </w:tc>
         <w:tc>
           <w:tcPr>
-            <w:tcW w:w="1473" w:type="dxa"/>
+            <w:tcW w:w="1470" w:type="dxa"/>
             <w:tcBorders>
               <w:top w:val="single" w:sz="4" w:space="0" w:color="F3F3F3"/>
               <w:start w:val="single" w:sz="4" w:space="0" w:color="F3F3F3"/>
@@ -4259,7 +4259,7 @@
         </w:tc>
         <w:tc>
           <w:tcPr>
-            <w:tcW w:w="1479" w:type="dxa"/>
+            <w:tcW w:w="1482" w:type="dxa"/>
             <w:tcBorders>
               <w:top w:val="single" w:sz="4" w:space="0" w:color="F3F3F3"/>
               <w:start w:val="single" w:sz="4" w:space="0" w:color="F3F3F3"/>
@@ -4294,7 +4294,7 @@
         <w:trPr/>
         <w:tc>
           <w:tcPr>
-            <w:tcW w:w="4317" w:type="dxa"/>
+            <w:tcW w:w="4314" w:type="dxa"/>
             <w:tcBorders>
               <w:top w:val="single" w:sz="4" w:space="0" w:color="F3F3F3"/>
               <w:start w:val="single" w:sz="4" w:space="0" w:color="F3F3F3"/>
@@ -4358,7 +4358,7 @@
         </w:tc>
         <w:tc>
           <w:tcPr>
-            <w:tcW w:w="1479" w:type="dxa"/>
+            <w:tcW w:w="1482" w:type="dxa"/>
             <w:tcBorders>
               <w:top w:val="single" w:sz="4" w:space="0" w:color="F3F3F3"/>
               <w:start w:val="single" w:sz="4" w:space="0" w:color="F3F3F3"/>
@@ -4390,7 +4390,7 @@
         </w:tc>
         <w:tc>
           <w:tcPr>
-            <w:tcW w:w="1473" w:type="dxa"/>
+            <w:tcW w:w="1470" w:type="dxa"/>
             <w:tcBorders>
               <w:top w:val="single" w:sz="4" w:space="0" w:color="F3F3F3"/>
               <w:start w:val="single" w:sz="4" w:space="0" w:color="F3F3F3"/>
@@ -4422,7 +4422,7 @@
         </w:tc>
         <w:tc>
           <w:tcPr>
-            <w:tcW w:w="1479" w:type="dxa"/>
+            <w:tcW w:w="1482" w:type="dxa"/>
             <w:tcBorders>
               <w:top w:val="single" w:sz="4" w:space="0" w:color="F3F3F3"/>
               <w:start w:val="single" w:sz="4" w:space="0" w:color="F3F3F3"/>
@@ -4457,7 +4457,7 @@
         <w:trPr/>
         <w:tc>
           <w:tcPr>
-            <w:tcW w:w="4317" w:type="dxa"/>
+            <w:tcW w:w="4314" w:type="dxa"/>
             <w:tcBorders>
               <w:top w:val="single" w:sz="4" w:space="0" w:color="F3F3F3"/>
               <w:start w:val="single" w:sz="4" w:space="0" w:color="F3F3F3"/>
@@ -4521,7 +4521,7 @@
         </w:tc>
         <w:tc>
           <w:tcPr>
-            <w:tcW w:w="1479" w:type="dxa"/>
+            <w:tcW w:w="1482" w:type="dxa"/>
             <w:tcBorders>
               <w:top w:val="single" w:sz="4" w:space="0" w:color="F3F3F3"/>
               <w:start w:val="single" w:sz="4" w:space="0" w:color="F3F3F3"/>
@@ -4553,7 +4553,7 @@
         </w:tc>
         <w:tc>
           <w:tcPr>
-            <w:tcW w:w="1473" w:type="dxa"/>
+            <w:tcW w:w="1470" w:type="dxa"/>
             <w:tcBorders>
               <w:top w:val="single" w:sz="4" w:space="0" w:color="F3F3F3"/>
               <w:start w:val="single" w:sz="4" w:space="0" w:color="F3F3F3"/>
@@ -4585,7 +4585,7 @@
         </w:tc>
         <w:tc>
           <w:tcPr>
-            <w:tcW w:w="1479" w:type="dxa"/>
+            <w:tcW w:w="1482" w:type="dxa"/>
             <w:tcBorders>
               <w:top w:val="single" w:sz="4" w:space="0" w:color="F3F3F3"/>
               <w:start w:val="single" w:sz="4" w:space="0" w:color="F3F3F3"/>
@@ -4620,7 +4620,7 @@
         <w:trPr/>
         <w:tc>
           <w:tcPr>
-            <w:tcW w:w="4317" w:type="dxa"/>
+            <w:tcW w:w="4314" w:type="dxa"/>
             <w:tcBorders>
               <w:top w:val="single" w:sz="4" w:space="0" w:color="F3F3F3"/>
               <w:start w:val="single" w:sz="4" w:space="0" w:color="F3F3F3"/>
@@ -4684,7 +4684,7 @@
         </w:tc>
         <w:tc>
           <w:tcPr>
-            <w:tcW w:w="1479" w:type="dxa"/>
+            <w:tcW w:w="1482" w:type="dxa"/>
             <w:tcBorders>
               <w:top w:val="single" w:sz="4" w:space="0" w:color="F3F3F3"/>
               <w:start w:val="single" w:sz="4" w:space="0" w:color="F3F3F3"/>
@@ -4716,7 +4716,7 @@
         </w:tc>
         <w:tc>
           <w:tcPr>
-            <w:tcW w:w="1473" w:type="dxa"/>
+            <w:tcW w:w="1470" w:type="dxa"/>
             <w:tcBorders>
               <w:top w:val="single" w:sz="4" w:space="0" w:color="F3F3F3"/>
               <w:start w:val="single" w:sz="4" w:space="0" w:color="F3F3F3"/>
@@ -4748,7 +4748,7 @@
         </w:tc>
         <w:tc>
           <w:tcPr>
-            <w:tcW w:w="1479" w:type="dxa"/>
+            <w:tcW w:w="1482" w:type="dxa"/>
             <w:tcBorders>
               <w:top w:val="single" w:sz="4" w:space="0" w:color="F3F3F3"/>
               <w:start w:val="single" w:sz="4" w:space="0" w:color="F3F3F3"/>
@@ -4783,7 +4783,7 @@
         <w:trPr/>
         <w:tc>
           <w:tcPr>
-            <w:tcW w:w="4317" w:type="dxa"/>
+            <w:tcW w:w="4314" w:type="dxa"/>
             <w:tcBorders>
               <w:top w:val="single" w:sz="4" w:space="0" w:color="F3F3F3"/>
               <w:start w:val="single" w:sz="4" w:space="0" w:color="F3F3F3"/>
@@ -4850,7 +4850,7 @@
         </w:tc>
         <w:tc>
           <w:tcPr>
-            <w:tcW w:w="1479" w:type="dxa"/>
+            <w:tcW w:w="1482" w:type="dxa"/>
             <w:tcBorders>
               <w:top w:val="single" w:sz="4" w:space="0" w:color="F3F3F3"/>
               <w:start w:val="single" w:sz="4" w:space="0" w:color="F3F3F3"/>
@@ -4884,7 +4884,7 @@
         </w:tc>
         <w:tc>
           <w:tcPr>
-            <w:tcW w:w="1473" w:type="dxa"/>
+            <w:tcW w:w="1470" w:type="dxa"/>
             <w:tcBorders>
               <w:top w:val="single" w:sz="4" w:space="0" w:color="F3F3F3"/>
               <w:start w:val="single" w:sz="4" w:space="0" w:color="F3F3F3"/>
@@ -4917,7 +4917,7 @@
         </w:tc>
         <w:tc>
           <w:tcPr>
-            <w:tcW w:w="1479" w:type="dxa"/>
+            <w:tcW w:w="1482" w:type="dxa"/>
             <w:tcBorders>
               <w:top w:val="single" w:sz="4" w:space="0" w:color="F3F3F3"/>
               <w:start w:val="single" w:sz="4" w:space="0" w:color="F3F3F3"/>
@@ -5075,9 +5075,9 @@
             </w:tblPr>
             <w:tblGrid>
               <w:gridCol w:w="1760"/>
-              <w:gridCol w:w="2457"/>
+              <w:gridCol w:w="2454"/>
               <w:gridCol w:w="1940"/>
-              <w:gridCol w:w="1922"/>
+              <w:gridCol w:w="1925"/>
               <w:gridCol w:w="2089"/>
             </w:tblGrid>
             <w:tr>
@@ -5113,7 +5113,7 @@
               </w:tc>
               <w:tc>
                 <w:tcPr>
-                  <w:tcW w:w="2457" w:type="dxa"/>
+                  <w:tcW w:w="2454" w:type="dxa"/>
                   <w:tcBorders/>
                   <w:shd w:fill="auto" w:val="clear"/>
                 </w:tcPr>
@@ -5169,7 +5169,7 @@
               </w:tc>
               <w:tc>
                 <w:tcPr>
-                  <w:tcW w:w="1922" w:type="dxa"/>
+                  <w:tcW w:w="1925" w:type="dxa"/>
                   <w:tcBorders/>
                   <w:shd w:fill="auto" w:val="clear"/>
                   <w:tcMar>
@@ -5294,7 +5294,7 @@
               </w:tc>
               <w:tc>
                 <w:tcPr>
-                  <w:tcW w:w="2457" w:type="dxa"/>
+                  <w:tcW w:w="2454" w:type="dxa"/>
                   <w:tcBorders/>
                   <w:shd w:fill="auto" w:val="clear"/>
                 </w:tcPr>
@@ -5350,7 +5350,7 @@
               </w:tc>
               <w:tc>
                 <w:tcPr>
-                  <w:tcW w:w="1922" w:type="dxa"/>
+                  <w:tcW w:w="1925" w:type="dxa"/>
                   <w:tcBorders/>
                   <w:shd w:fill="auto" w:val="clear"/>
                   <w:tcMar>
@@ -5878,11 +5878,11 @@
             </w:tblPr>
             <w:tblGrid>
               <w:gridCol w:w="2415"/>
-              <w:gridCol w:w="237"/>
+              <w:gridCol w:w="234"/>
               <w:gridCol w:w="2115"/>
-              <w:gridCol w:w="258"/>
-              <w:gridCol w:w="1917"/>
-              <w:gridCol w:w="243"/>
+              <w:gridCol w:w="261"/>
+              <w:gridCol w:w="1914"/>
+              <w:gridCol w:w="246"/>
               <w:gridCol w:w="2955"/>
             </w:tblGrid>
             <w:tr>
@@ -5891,7 +5891,7 @@
               </w:trPr>
               <w:tc>
                 <w:tcPr>
-                  <w:tcW w:w="4767" w:type="dxa"/>
+                  <w:tcW w:w="4764" w:type="dxa"/>
                   <w:gridSpan w:val="3"/>
                   <w:tcBorders/>
                   <w:shd w:fill="EFEFEF" w:val="clear"/>
@@ -5919,7 +5919,7 @@
               </w:tc>
               <w:tc>
                 <w:tcPr>
-                  <w:tcW w:w="258" w:type="dxa"/>
+                  <w:tcW w:w="261" w:type="dxa"/>
                   <w:tcBorders/>
                   <w:shd w:fill="auto" w:val="clear"/>
                 </w:tcPr>
@@ -5998,7 +5998,7 @@
               </w:tc>
               <w:tc>
                 <w:tcPr>
-                  <w:tcW w:w="237" w:type="dxa"/>
+                  <w:tcW w:w="234" w:type="dxa"/>
                   <w:tcBorders/>
                   <w:shd w:fill="auto" w:val="clear"/>
                 </w:tcPr>
@@ -6048,7 +6048,7 @@
               </w:tc>
               <w:tc>
                 <w:tcPr>
-                  <w:tcW w:w="258" w:type="dxa"/>
+                  <w:tcW w:w="261" w:type="dxa"/>
                   <w:tcBorders/>
                   <w:shd w:fill="auto" w:val="clear"/>
                 </w:tcPr>
@@ -6072,7 +6072,7 @@
               </w:tc>
               <w:tc>
                 <w:tcPr>
-                  <w:tcW w:w="1917" w:type="dxa"/>
+                  <w:tcW w:w="1914" w:type="dxa"/>
                   <w:tcBorders/>
                   <w:shd w:fill="auto" w:val="clear"/>
                 </w:tcPr>
@@ -6097,7 +6097,7 @@
               </w:tc>
               <w:tc>
                 <w:tcPr>
-                  <w:tcW w:w="243" w:type="dxa"/>
+                  <w:tcW w:w="246" w:type="dxa"/>
                   <w:tcBorders/>
                   <w:shd w:fill="auto" w:val="clear"/>
                 </w:tcPr>
@@ -6175,7 +6175,7 @@
               </w:tc>
               <w:tc>
                 <w:tcPr>
-                  <w:tcW w:w="237" w:type="dxa"/>
+                  <w:tcW w:w="234" w:type="dxa"/>
                   <w:tcBorders/>
                   <w:shd w:fill="auto" w:val="clear"/>
                 </w:tcPr>
@@ -6225,7 +6225,7 @@
               </w:tc>
               <w:tc>
                 <w:tcPr>
-                  <w:tcW w:w="258" w:type="dxa"/>
+                  <w:tcW w:w="261" w:type="dxa"/>
                   <w:tcBorders/>
                   <w:shd w:fill="auto" w:val="clear"/>
                 </w:tcPr>
@@ -6249,7 +6249,7 @@
               </w:tc>
               <w:tc>
                 <w:tcPr>
-                  <w:tcW w:w="1917" w:type="dxa"/>
+                  <w:tcW w:w="1914" w:type="dxa"/>
                   <w:tcBorders/>
                   <w:shd w:fill="auto" w:val="clear"/>
                 </w:tcPr>
@@ -6274,7 +6274,7 @@
               </w:tc>
               <w:tc>
                 <w:tcPr>
-                  <w:tcW w:w="243" w:type="dxa"/>
+                  <w:tcW w:w="246" w:type="dxa"/>
                   <w:tcBorders/>
                   <w:shd w:fill="auto" w:val="clear"/>
                 </w:tcPr>
@@ -6352,7 +6352,7 @@
               </w:tc>
               <w:tc>
                 <w:tcPr>
-                  <w:tcW w:w="237" w:type="dxa"/>
+                  <w:tcW w:w="234" w:type="dxa"/>
                   <w:tcBorders/>
                   <w:shd w:fill="auto" w:val="clear"/>
                 </w:tcPr>
@@ -6402,7 +6402,7 @@
               </w:tc>
               <w:tc>
                 <w:tcPr>
-                  <w:tcW w:w="258" w:type="dxa"/>
+                  <w:tcW w:w="261" w:type="dxa"/>
                   <w:tcBorders/>
                   <w:shd w:fill="auto" w:val="clear"/>
                 </w:tcPr>
@@ -6426,7 +6426,7 @@
               </w:tc>
               <w:tc>
                 <w:tcPr>
-                  <w:tcW w:w="1917" w:type="dxa"/>
+                  <w:tcW w:w="1914" w:type="dxa"/>
                   <w:tcBorders/>
                   <w:shd w:fill="auto" w:val="clear"/>
                 </w:tcPr>
@@ -6451,7 +6451,7 @@
               </w:tc>
               <w:tc>
                 <w:tcPr>
-                  <w:tcW w:w="243" w:type="dxa"/>
+                  <w:tcW w:w="246" w:type="dxa"/>
                   <w:tcBorders/>
                   <w:shd w:fill="auto" w:val="clear"/>
                 </w:tcPr>
@@ -6528,7 +6528,7 @@
               </w:tc>
               <w:tc>
                 <w:tcPr>
-                  <w:tcW w:w="237" w:type="dxa"/>
+                  <w:tcW w:w="234" w:type="dxa"/>
                   <w:tcBorders/>
                   <w:shd w:fill="auto" w:val="clear"/>
                 </w:tcPr>
@@ -6577,7 +6577,7 @@
               </w:tc>
               <w:tc>
                 <w:tcPr>
-                  <w:tcW w:w="258" w:type="dxa"/>
+                  <w:tcW w:w="261" w:type="dxa"/>
                   <w:tcBorders/>
                   <w:shd w:fill="auto" w:val="clear"/>
                 </w:tcPr>
@@ -6601,7 +6601,7 @@
               </w:tc>
               <w:tc>
                 <w:tcPr>
-                  <w:tcW w:w="1917" w:type="dxa"/>
+                  <w:tcW w:w="1914" w:type="dxa"/>
                   <w:tcBorders/>
                   <w:shd w:fill="auto" w:val="clear"/>
                 </w:tcPr>
@@ -6628,7 +6628,7 @@
               </w:tc>
               <w:tc>
                 <w:tcPr>
-                  <w:tcW w:w="243" w:type="dxa"/>
+                  <w:tcW w:w="246" w:type="dxa"/>
                   <w:tcBorders/>
                   <w:shd w:fill="auto" w:val="clear"/>
                 </w:tcPr>
@@ -6882,11 +6882,11 @@
             </w:tblPr>
             <w:tblGrid>
               <w:gridCol w:w="2415"/>
-              <w:gridCol w:w="237"/>
+              <w:gridCol w:w="234"/>
               <w:gridCol w:w="2115"/>
-              <w:gridCol w:w="258"/>
-              <w:gridCol w:w="1917"/>
-              <w:gridCol w:w="243"/>
+              <w:gridCol w:w="261"/>
+              <w:gridCol w:w="1914"/>
+              <w:gridCol w:w="246"/>
               <w:gridCol w:w="2955"/>
             </w:tblGrid>
             <w:tr>
@@ -6895,7 +6895,7 @@
               </w:trPr>
               <w:tc>
                 <w:tcPr>
-                  <w:tcW w:w="4767" w:type="dxa"/>
+                  <w:tcW w:w="4764" w:type="dxa"/>
                   <w:gridSpan w:val="3"/>
                   <w:tcBorders/>
                   <w:shd w:fill="EFEFEF" w:val="clear"/>
@@ -6923,7 +6923,7 @@
               </w:tc>
               <w:tc>
                 <w:tcPr>
-                  <w:tcW w:w="258" w:type="dxa"/>
+                  <w:tcW w:w="261" w:type="dxa"/>
                   <w:tcBorders/>
                   <w:shd w:fill="auto" w:val="clear"/>
                 </w:tcPr>
@@ -7002,7 +7002,7 @@
               </w:tc>
               <w:tc>
                 <w:tcPr>
-                  <w:tcW w:w="237" w:type="dxa"/>
+                  <w:tcW w:w="234" w:type="dxa"/>
                   <w:tcBorders/>
                   <w:shd w:fill="auto" w:val="clear"/>
                 </w:tcPr>
@@ -7052,7 +7052,7 @@
               </w:tc>
               <w:tc>
                 <w:tcPr>
-                  <w:tcW w:w="258" w:type="dxa"/>
+                  <w:tcW w:w="261" w:type="dxa"/>
                   <w:tcBorders/>
                   <w:shd w:fill="auto" w:val="clear"/>
                 </w:tcPr>
@@ -7076,7 +7076,7 @@
               </w:tc>
               <w:tc>
                 <w:tcPr>
-                  <w:tcW w:w="1917" w:type="dxa"/>
+                  <w:tcW w:w="1914" w:type="dxa"/>
                   <w:tcBorders/>
                   <w:shd w:fill="auto" w:val="clear"/>
                 </w:tcPr>
@@ -7101,7 +7101,7 @@
               </w:tc>
               <w:tc>
                 <w:tcPr>
-                  <w:tcW w:w="243" w:type="dxa"/>
+                  <w:tcW w:w="246" w:type="dxa"/>
                   <w:tcBorders/>
                   <w:shd w:fill="auto" w:val="clear"/>
                 </w:tcPr>
@@ -7179,7 +7179,7 @@
               </w:tc>
               <w:tc>
                 <w:tcPr>
-                  <w:tcW w:w="237" w:type="dxa"/>
+                  <w:tcW w:w="234" w:type="dxa"/>
                   <w:tcBorders/>
                   <w:shd w:fill="auto" w:val="clear"/>
                 </w:tcPr>
@@ -7229,7 +7229,7 @@
               </w:tc>
               <w:tc>
                 <w:tcPr>
-                  <w:tcW w:w="258" w:type="dxa"/>
+                  <w:tcW w:w="261" w:type="dxa"/>
                   <w:tcBorders/>
                   <w:shd w:fill="auto" w:val="clear"/>
                 </w:tcPr>
@@ -7253,7 +7253,7 @@
               </w:tc>
               <w:tc>
                 <w:tcPr>
-                  <w:tcW w:w="1917" w:type="dxa"/>
+                  <w:tcW w:w="1914" w:type="dxa"/>
                   <w:tcBorders/>
                   <w:shd w:fill="auto" w:val="clear"/>
                 </w:tcPr>
@@ -7278,7 +7278,7 @@
               </w:tc>
               <w:tc>
                 <w:tcPr>
-                  <w:tcW w:w="243" w:type="dxa"/>
+                  <w:tcW w:w="246" w:type="dxa"/>
                   <w:tcBorders/>
                   <w:shd w:fill="auto" w:val="clear"/>
                 </w:tcPr>
@@ -7356,7 +7356,7 @@
               </w:tc>
               <w:tc>
                 <w:tcPr>
-                  <w:tcW w:w="237" w:type="dxa"/>
+                  <w:tcW w:w="234" w:type="dxa"/>
                   <w:tcBorders/>
                   <w:shd w:fill="auto" w:val="clear"/>
                 </w:tcPr>
@@ -7406,7 +7406,7 @@
               </w:tc>
               <w:tc>
                 <w:tcPr>
-                  <w:tcW w:w="258" w:type="dxa"/>
+                  <w:tcW w:w="261" w:type="dxa"/>
                   <w:tcBorders/>
                   <w:shd w:fill="auto" w:val="clear"/>
                 </w:tcPr>
@@ -7430,7 +7430,7 @@
               </w:tc>
               <w:tc>
                 <w:tcPr>
-                  <w:tcW w:w="1917" w:type="dxa"/>
+                  <w:tcW w:w="1914" w:type="dxa"/>
                   <w:tcBorders/>
                   <w:shd w:fill="auto" w:val="clear"/>
                 </w:tcPr>
@@ -7455,7 +7455,7 @@
               </w:tc>
               <w:tc>
                 <w:tcPr>
-                  <w:tcW w:w="243" w:type="dxa"/>
+                  <w:tcW w:w="246" w:type="dxa"/>
                   <w:tcBorders/>
                   <w:shd w:fill="auto" w:val="clear"/>
                 </w:tcPr>
@@ -7532,7 +7532,7 @@
               </w:tc>
               <w:tc>
                 <w:tcPr>
-                  <w:tcW w:w="237" w:type="dxa"/>
+                  <w:tcW w:w="234" w:type="dxa"/>
                   <w:tcBorders/>
                   <w:shd w:fill="auto" w:val="clear"/>
                 </w:tcPr>
@@ -7581,7 +7581,7 @@
               </w:tc>
               <w:tc>
                 <w:tcPr>
-                  <w:tcW w:w="258" w:type="dxa"/>
+                  <w:tcW w:w="261" w:type="dxa"/>
                   <w:tcBorders/>
                   <w:shd w:fill="auto" w:val="clear"/>
                 </w:tcPr>
@@ -7605,7 +7605,7 @@
               </w:tc>
               <w:tc>
                 <w:tcPr>
-                  <w:tcW w:w="1917" w:type="dxa"/>
+                  <w:tcW w:w="1914" w:type="dxa"/>
                   <w:tcBorders/>
                   <w:shd w:fill="auto" w:val="clear"/>
                 </w:tcPr>
@@ -7632,7 +7632,7 @@
               </w:tc>
               <w:tc>
                 <w:tcPr>
-                  <w:tcW w:w="243" w:type="dxa"/>
+                  <w:tcW w:w="246" w:type="dxa"/>
                   <w:tcBorders/>
                   <w:shd w:fill="auto" w:val="clear"/>
                 </w:tcPr>
@@ -10542,14 +10542,14 @@
         <w:tblLook w:val="0600"/>
       </w:tblPr>
       <w:tblGrid>
-        <w:gridCol w:w="4692"/>
-        <w:gridCol w:w="5532"/>
+        <w:gridCol w:w="4689"/>
+        <w:gridCol w:w="5535"/>
       </w:tblGrid>
       <w:tr>
         <w:trPr/>
         <w:tc>
           <w:tcPr>
-            <w:tcW w:w="4692" w:type="dxa"/>
+            <w:tcW w:w="4689" w:type="dxa"/>
             <w:tcBorders/>
             <w:shd w:fill="auto" w:val="clear"/>
           </w:tcPr>
@@ -10623,7 +10623,6 @@
                     <w:pStyle w:val="normal1"/>
                     <w:rPr>
                       <w:rFonts w:ascii="Calibri" w:hAnsi="Calibri" w:eastAsia="Calibri" w:cs="Calibri"/>
-                      <w:color w:val="FFFFFF"/>
                       <w:sz w:val="20"/>
                       <w:szCs w:val="20"/>
                     </w:rPr>
@@ -10631,11 +10630,9 @@
                   <w:r>
                     <w:rPr>
                       <w:rFonts w:eastAsia="Calibri" w:cs="Calibri" w:ascii="Calibri" w:hAnsi="Calibri"/>
-                      <w:color w:val="FFFFFF"/>
-                      <w:sz w:val="20"/>
-                      <w:szCs w:val="20"/>
-                    </w:rPr>
-                    <w:t>[sig|req|signer1]</w:t>
+                      <w:sz w:val="20"/>
+                      <w:szCs w:val="20"/>
+                    </w:rPr>
                   </w:r>
                 </w:p>
                 <w:p>
@@ -10688,7 +10685,7 @@
                       <w:sz w:val="20"/>
                       <w:szCs w:val="20"/>
                     </w:rPr>
-                    <w:t>Buyer Company name</w:t>
+                    <w:t>Buyer Company Name</w:t>
                   </w:r>
                 </w:p>
                 <w:p>
@@ -10752,7 +10749,7 @@
         </w:tc>
         <w:tc>
           <w:tcPr>
-            <w:tcW w:w="5532" w:type="dxa"/>
+            <w:tcW w:w="5535" w:type="dxa"/>
             <w:tcBorders/>
             <w:shd w:fill="auto" w:val="clear"/>
           </w:tcPr>
@@ -10781,19 +10778,111 @@
           <w:p>
             <w:pPr>
               <w:pStyle w:val="normal1"/>
-              <w:spacing w:lineRule="auto" w:line="240" w:before="0" w:after="0"/>
+              <w:ind w:hanging="0" w:start="147"/>
               <w:rPr>
                 <w:rFonts w:ascii="Calibri" w:hAnsi="Calibri" w:eastAsia="Calibri" w:cs="Calibri"/>
-                <w:sz w:val="2"/>
-                <w:szCs w:val="2"/>
+                <w:sz w:val="20"/>
+                <w:szCs w:val="20"/>
+                <w:u w:val="single"/>
               </w:rPr>
             </w:pPr>
             <w:r>
               <w:rPr>
                 <w:rFonts w:eastAsia="Calibri" w:cs="Calibri" w:ascii="Calibri" w:hAnsi="Calibri"/>
-                <w:sz w:val="2"/>
-                <w:szCs w:val="2"/>
-              </w:rPr>
+                <w:sz w:val="20"/>
+                <w:szCs w:val="20"/>
+                <w:u w:val="single"/>
+              </w:rPr>
+            </w:r>
+          </w:p>
+          <w:p>
+            <w:pPr>
+              <w:pStyle w:val="normal1"/>
+              <w:ind w:hanging="0" w:start="147"/>
+              <w:rPr>
+                <w:rFonts w:ascii="Calibri" w:hAnsi="Calibri" w:eastAsia="Calibri" w:cs="Calibri"/>
+                <w:sz w:val="20"/>
+                <w:szCs w:val="20"/>
+                <w:u w:val="single"/>
+              </w:rPr>
+            </w:pPr>
+            <w:r>
+              <w:rPr>
+                <w:rFonts w:eastAsia="Calibri" w:cs="Calibri" w:ascii="Calibri" w:hAnsi="Calibri"/>
+                <w:sz w:val="20"/>
+                <w:szCs w:val="20"/>
+                <w:u w:val="single"/>
+              </w:rPr>
+            </w:r>
+          </w:p>
+          <w:p>
+            <w:pPr>
+              <w:pStyle w:val="normal1"/>
+              <w:ind w:hanging="0" w:start="147"/>
+              <w:rPr>
+                <w:rFonts w:ascii="Calibri" w:hAnsi="Calibri" w:eastAsia="Calibri" w:cs="Calibri"/>
+                <w:sz w:val="20"/>
+                <w:szCs w:val="20"/>
+                <w:u w:val="single"/>
+              </w:rPr>
+            </w:pPr>
+            <w:r>
+              <w:rPr>
+                <w:rFonts w:eastAsia="Calibri" w:cs="Calibri" w:ascii="Calibri" w:hAnsi="Calibri"/>
+                <w:sz w:val="20"/>
+                <w:szCs w:val="20"/>
+                <w:u w:val="single"/>
+              </w:rPr>
+            </w:r>
+          </w:p>
+          <w:p>
+            <w:pPr>
+              <w:pStyle w:val="normal1"/>
+              <w:ind w:hanging="0" w:start="147"/>
+              <w:rPr>
+                <w:rFonts w:ascii="Calibri" w:hAnsi="Calibri" w:eastAsia="Calibri" w:cs="Calibri"/>
+                <w:b w:val="false"/>
+                <w:bCs w:val="false"/>
+                <w:sz w:val="20"/>
+                <w:szCs w:val="20"/>
+                <w:u w:val="none"/>
+              </w:rPr>
+            </w:pPr>
+            <w:r>
+              <w:rPr>
+                <w:rFonts w:eastAsia="Calibri" w:cs="Calibri" w:ascii="Calibri" w:hAnsi="Calibri"/>
+                <w:b w:val="false"/>
+                <w:bCs w:val="false"/>
+                <w:sz w:val="20"/>
+                <w:szCs w:val="20"/>
+                <w:u w:val="none"/>
+              </w:rPr>
+              <w:t>Manager Name</w:t>
+            </w:r>
+          </w:p>
+          <w:p>
+            <w:pPr>
+              <w:pStyle w:val="normal1"/>
+              <w:ind w:hanging="0" w:start="147"/>
+              <w:rPr>
+                <w:rFonts w:ascii="Calibri" w:hAnsi="Calibri" w:eastAsia="Calibri" w:cs="Calibri"/>
+                <w:b w:val="false"/>
+                <w:bCs w:val="false"/>
+                <w:sz w:val="20"/>
+                <w:szCs w:val="20"/>
+                <w:u w:val="none"/>
+              </w:rPr>
+            </w:pPr>
+            <w:r>
+              <w:rPr>
+                <w:rFonts w:eastAsia="Calibri" w:cs="Calibri" w:ascii="Calibri" w:hAnsi="Calibri"/>
+                <w:b w:val="false"/>
+                <w:bCs w:val="false"/>
+                <w:sz w:val="20"/>
+                <w:szCs w:val="20"/>
+                <w:u w:val="none"/>
+              </w:rPr>
+              <w:t>Manager Company Name</w:t>
             </w:r>
           </w:p>
         </w:tc>

</xml_diff>